<commit_message>
feat: update coloring price table, add detailed service descriptions category, and sync knowledge base
</commit_message>
<xml_diff>
--- a/data/knowledge/Data.docx
+++ b/data/knowledge/Data.docx
@@ -5481,6 +5481,12 @@
                   <w:insideH w:val="single" w:color="auto" w:sz="4" w:space="0"/>
                   <w:insideV w:val="none" w:color="auto" w:sz="0" w:space="0"/>
                 </w:tblBorders>
+                <w:tblCellMar>
+                  <w:top w:w="0" w:type="dxa"/>
+                  <w:left w:w="108" w:type="dxa"/>
+                  <w:bottom w:w="0" w:type="dxa"/>
+                  <w:right w:w="108" w:type="dxa"/>
+                </w:tblCellMar>
               </w:tblPrEx>
               <w:tc>
                 <w:tcPr>
@@ -5852,11 +5858,20 @@
                   </w:pPr>
                   <w:r>
                     <w:rPr>
+                      <w:rFonts w:hint="default" w:cstheme="minorHAnsi"/>
+                      <w:sz w:val="24"/>
+                      <w:szCs w:val="24"/>
+                      <w:lang w:val="en-US"/>
+                    </w:rPr>
+                    <w:t>35</w:t>
+                  </w:r>
+                  <w:r>
+                    <w:rPr>
                       <w:rFonts w:cstheme="minorHAnsi"/>
                       <w:sz w:val="24"/>
                       <w:szCs w:val="24"/>
                     </w:rPr>
-                    <w:t>100.000</w:t>
+                    <w:t>0.000</w:t>
                   </w:r>
                 </w:p>
               </w:tc>
@@ -5981,11 +5996,37 @@
             </w:pPr>
             <w:r>
               <w:rPr>
-                <w:rFonts w:cstheme="minorHAnsi"/>
-                <w:sz w:val="24"/>
-                <w:szCs w:val="24"/>
-              </w:rPr>
-              <w:t>500.000 – 700.000</w:t>
+                <w:rFonts w:hint="default" w:cstheme="minorHAnsi"/>
+                <w:sz w:val="24"/>
+                <w:szCs w:val="24"/>
+                <w:lang w:val="en-US"/>
+              </w:rPr>
+              <w:t>60</w:t>
+            </w:r>
+            <w:r>
+              <w:rPr>
+                <w:rFonts w:cstheme="minorHAnsi"/>
+                <w:sz w:val="24"/>
+                <w:szCs w:val="24"/>
+              </w:rPr>
+              <w:t xml:space="preserve">0.000 – </w:t>
+            </w:r>
+            <w:r>
+              <w:rPr>
+                <w:rFonts w:hint="default" w:cstheme="minorHAnsi"/>
+                <w:sz w:val="24"/>
+                <w:szCs w:val="24"/>
+                <w:lang w:val="en-US"/>
+              </w:rPr>
+              <w:t>8</w:t>
+            </w:r>
+            <w:r>
+              <w:rPr>
+                <w:rFonts w:cstheme="minorHAnsi"/>
+                <w:sz w:val="24"/>
+                <w:szCs w:val="24"/>
+              </w:rPr>
+              <w:t>00.000</w:t>
             </w:r>
           </w:p>
         </w:tc>
@@ -9300,15 +9341,17 @@
           <w:sz w:val="24"/>
           <w:szCs w:val="24"/>
         </w:rPr>
-        <w:t xml:space="preserve">Nhuộm cơ bản: </w:t>
+        <w:t>Nhuộm:</w:t>
       </w:r>
       <w:r>
         <w:rPr>
           <w:rFonts w:cstheme="minorHAnsi"/>
+          <w:b w:val="0"/>
+          <w:bCs w:val="0"/>
           <w:sz w:val="24"/>
           <w:szCs w:val="24"/>
         </w:rPr>
-        <w:t>Sử dụng các dòng thuốc chính hãng như Luminux, novel, RG,… Phù hợp cho nhuộm màu thời trang, màu nền, màu tự nhiên.</w:t>
+        <w:t xml:space="preserve"> Sử dụng các dòng thuốc chính hãng như Luminux, novel, RG ...Phù hợp cho nhuộm màu thời trang, màu nền, màu tự nhiên.</w:t>
       </w:r>
     </w:p>
     <w:p>
@@ -9342,7 +9385,17 @@
           <w:sz w:val="24"/>
           <w:szCs w:val="24"/>
         </w:rPr>
-        <w:t xml:space="preserve"> Sử dụng các dòng thuốc chính hãng như L’Oreal Majirel, Milbon, Schwarzkopf,… Phù hợp cho nhuộm màu thời trang, màu nền, màu tự nhiên.</w:t>
+        <w:t xml:space="preserve"> Sử dụng High-end – Vegan như L'Or</w:t>
+      </w:r>
+      <w:bookmarkStart w:id="0" w:name="_GoBack"/>
+      <w:bookmarkEnd w:id="0"/>
+      <w:r>
+        <w:rPr>
+          <w:rFonts w:cstheme="minorHAnsi"/>
+          <w:sz w:val="24"/>
+          <w:szCs w:val="24"/>
+        </w:rPr>
+        <w:t>éal INOA / Majirel , Milbon, Schwarzkopf ... Phù hợp cho nhuộm màu thời trang, màu nền, màu tự nhiên , ưu tiên độ an toàn, giảm mùi, giảm kích ứng và cho màu sắc mềm – bền – bóng đẹp.</w:t>
       </w:r>
     </w:p>
     <w:p>
@@ -9354,6 +9407,8 @@
         </w:numPr>
         <w:rPr>
           <w:rFonts w:cstheme="minorHAnsi"/>
+          <w:b w:val="0"/>
+          <w:bCs w:val="0"/>
           <w:sz w:val="24"/>
           <w:szCs w:val="24"/>
         </w:rPr>
@@ -9366,111 +9421,17 @@
           <w:sz w:val="24"/>
           <w:szCs w:val="24"/>
         </w:rPr>
-        <w:t xml:space="preserve">Nhuộm Vegan: </w:t>
-      </w:r>
-      <w:r>
-        <w:rPr>
-          <w:rFonts w:cstheme="minorHAnsi"/>
-          <w:sz w:val="24"/>
-          <w:szCs w:val="24"/>
-        </w:rPr>
-        <w:t>Sử dụng L’Oreal INOA / dòng High-end-vegan, ưu tiên độ an toàn, giảm mùi, giảm kích ứng và cho màu sắc mềm-bền-bóng đẹp.</w:t>
-      </w:r>
-    </w:p>
-    <w:p>
-      <w:pPr>
-        <w:pStyle w:val="6"/>
-        <w:numPr>
-          <w:ilvl w:val="0"/>
-          <w:numId w:val="5"/>
-        </w:numPr>
-        <w:rPr>
-          <w:rFonts w:cstheme="minorHAnsi"/>
-          <w:sz w:val="24"/>
-          <w:szCs w:val="24"/>
-        </w:rPr>
-      </w:pPr>
-      <w:r>
-        <w:rPr>
-          <w:rFonts w:cstheme="minorHAnsi"/>
-          <w:b/>
-          <w:bCs/>
-          <w:sz w:val="24"/>
-          <w:szCs w:val="24"/>
-        </w:rPr>
-        <w:t xml:space="preserve">Nâng tone: </w:t>
-      </w:r>
-      <w:r>
-        <w:rPr>
-          <w:rFonts w:cstheme="minorHAnsi"/>
-          <w:sz w:val="24"/>
-          <w:szCs w:val="24"/>
-        </w:rPr>
-        <w:t xml:space="preserve">Dành cho nền tóc cần sáng nhẹ trước khi lên màu, hạn chế tiếp xâm lấn tóc. </w:t>
-      </w:r>
-    </w:p>
-    <w:p>
-      <w:pPr>
-        <w:pStyle w:val="6"/>
-        <w:numPr>
-          <w:ilvl w:val="0"/>
-          <w:numId w:val="5"/>
-        </w:numPr>
-        <w:rPr>
-          <w:rFonts w:cstheme="minorHAnsi"/>
-          <w:sz w:val="24"/>
-          <w:szCs w:val="24"/>
-        </w:rPr>
-      </w:pPr>
-      <w:r>
-        <w:rPr>
-          <w:rFonts w:cstheme="minorHAnsi"/>
-          <w:b/>
-          <w:bCs/>
-          <w:sz w:val="24"/>
-          <w:szCs w:val="24"/>
-        </w:rPr>
-        <w:t xml:space="preserve">Tẩy tóc / bóc màu: </w:t>
-      </w:r>
-      <w:r>
-        <w:rPr>
-          <w:rFonts w:cstheme="minorHAnsi"/>
-          <w:sz w:val="24"/>
-          <w:szCs w:val="24"/>
-        </w:rPr>
-        <w:t>Áp dụng cho các trường hợp cần xử lý nền tóc cũ, màu tối, màu tích tụ.</w:t>
-      </w:r>
-    </w:p>
-    <w:p>
-      <w:pPr>
-        <w:pStyle w:val="6"/>
-        <w:numPr>
-          <w:ilvl w:val="0"/>
-          <w:numId w:val="5"/>
-        </w:numPr>
-        <w:rPr>
-          <w:rFonts w:cstheme="minorHAnsi"/>
-          <w:sz w:val="24"/>
-          <w:szCs w:val="24"/>
-        </w:rPr>
-      </w:pPr>
-      <w:r>
-        <w:rPr>
-          <w:rFonts w:cstheme="minorHAnsi"/>
-          <w:b/>
-          <w:bCs/>
-          <w:sz w:val="24"/>
-          <w:szCs w:val="24"/>
-        </w:rPr>
         <w:t xml:space="preserve">Tẩy chân tóc: </w:t>
       </w:r>
       <w:r>
         <w:rPr>
           <w:rFonts w:cstheme="minorHAnsi"/>
+          <w:b w:val="0"/>
+          <w:bCs w:val="0"/>
           <w:sz w:val="24"/>
           <w:szCs w:val="24"/>
         </w:rPr>
-        <w:t>Là dịch vụ kỹ thuật cao, gồm nhiều công đoạn để đảm bảo màu đều từ chân ra ngọn, chưa phải giá hoàn thiện.</w:t>
+        <w:t>Chưa phải giá hoàn thiện, tẩy chân cần nhiều công đoạn chuyên môn để cho ra mái tóc đều nền từ trong ra ngoài. Bạn vui lòng trao đổi trực tiếp cùng stylist để được tư vấn báo giá phù hợp nhất.</w:t>
       </w:r>
     </w:p>
     <w:p>
@@ -15703,7 +15664,24 @@
                 <w:sz w:val="24"/>
                 <w:szCs w:val="24"/>
               </w:rPr>
-              <w:t>1.700.000</w:t>
+              <w:t>1.</w:t>
+            </w:r>
+            <w:r>
+              <w:rPr>
+                <w:rFonts w:hint="default" w:cstheme="minorHAnsi"/>
+                <w:sz w:val="24"/>
+                <w:szCs w:val="24"/>
+                <w:lang w:val="en-US"/>
+              </w:rPr>
+              <w:t>8</w:t>
+            </w:r>
+            <w:r>
+              <w:rPr>
+                <w:rFonts w:cstheme="minorHAnsi"/>
+                <w:sz w:val="24"/>
+                <w:szCs w:val="24"/>
+              </w:rPr>
+              <w:t>00.000</w:t>
             </w:r>
           </w:p>
         </w:tc>
@@ -15725,7 +15703,24 @@
                 <w:sz w:val="24"/>
                 <w:szCs w:val="24"/>
               </w:rPr>
-              <w:t>2.300.000</w:t>
+              <w:t>2.</w:t>
+            </w:r>
+            <w:r>
+              <w:rPr>
+                <w:rFonts w:hint="default" w:cstheme="minorHAnsi"/>
+                <w:sz w:val="24"/>
+                <w:szCs w:val="24"/>
+                <w:lang w:val="en-US"/>
+              </w:rPr>
+              <w:t>5</w:t>
+            </w:r>
+            <w:r>
+              <w:rPr>
+                <w:rFonts w:cstheme="minorHAnsi"/>
+                <w:sz w:val="24"/>
+                <w:szCs w:val="24"/>
+              </w:rPr>
+              <w:t>00.000</w:t>
             </w:r>
           </w:p>
         </w:tc>
@@ -15747,7 +15742,24 @@
                 <w:sz w:val="24"/>
                 <w:szCs w:val="24"/>
               </w:rPr>
-              <w:t>2.600.000</w:t>
+              <w:t>2.</w:t>
+            </w:r>
+            <w:r>
+              <w:rPr>
+                <w:rFonts w:hint="default" w:cstheme="minorHAnsi"/>
+                <w:sz w:val="24"/>
+                <w:szCs w:val="24"/>
+                <w:lang w:val="en-US"/>
+              </w:rPr>
+              <w:t>8</w:t>
+            </w:r>
+            <w:r>
+              <w:rPr>
+                <w:rFonts w:cstheme="minorHAnsi"/>
+                <w:sz w:val="24"/>
+                <w:szCs w:val="24"/>
+              </w:rPr>
+              <w:t>00.000</w:t>
             </w:r>
           </w:p>
         </w:tc>
@@ -18374,12 +18386,6 @@
                   <w:insideH w:val="single" w:color="auto" w:sz="4" w:space="0"/>
                   <w:insideV w:val="single" w:color="auto" w:sz="4" w:space="0"/>
                 </w:tblBorders>
-                <w:tblCellMar>
-                  <w:top w:w="0" w:type="dxa"/>
-                  <w:left w:w="108" w:type="dxa"/>
-                  <w:bottom w:w="0" w:type="dxa"/>
-                  <w:right w:w="108" w:type="dxa"/>
-                </w:tblCellMar>
               </w:tblPrEx>
               <w:tc>
                 <w:tcPr>
@@ -21586,6 +21592,209 @@
         <w:tc>
           <w:tcPr>
             <w:tcW w:w="2092" w:type="dxa"/>
+          </w:tcPr>
+          <w:p>
+            <w:pPr>
+              <w:rPr>
+                <w:rFonts w:cstheme="minorHAnsi"/>
+                <w:b/>
+                <w:bCs/>
+                <w:sz w:val="22"/>
+                <w:szCs w:val="22"/>
+              </w:rPr>
+            </w:pPr>
+          </w:p>
+          <w:tbl>
+            <w:tblPr>
+              <w:tblStyle w:val="5"/>
+              <w:tblW w:w="0" w:type="auto"/>
+              <w:tblInd w:w="0" w:type="dxa"/>
+              <w:tblBorders>
+                <w:top w:val="single" w:color="auto" w:sz="4" w:space="0"/>
+                <w:left w:val="single" w:color="auto" w:sz="4" w:space="0"/>
+                <w:bottom w:val="single" w:color="auto" w:sz="4" w:space="0"/>
+                <w:right w:val="single" w:color="auto" w:sz="4" w:space="0"/>
+                <w:insideH w:val="single" w:color="auto" w:sz="4" w:space="0"/>
+                <w:insideV w:val="single" w:color="auto" w:sz="4" w:space="0"/>
+              </w:tblBorders>
+              <w:tblLayout w:type="autofit"/>
+              <w:tblCellMar>
+                <w:top w:w="0" w:type="dxa"/>
+                <w:left w:w="108" w:type="dxa"/>
+                <w:bottom w:w="0" w:type="dxa"/>
+                <w:right w:w="108" w:type="dxa"/>
+              </w:tblCellMar>
+            </w:tblPr>
+            <w:tblGrid>
+              <w:gridCol w:w="1904"/>
+            </w:tblGrid>
+            <w:tr>
+              <w:tblPrEx>
+                <w:tblBorders>
+                  <w:top w:val="single" w:color="auto" w:sz="4" w:space="0"/>
+                  <w:left w:val="single" w:color="auto" w:sz="4" w:space="0"/>
+                  <w:bottom w:val="single" w:color="auto" w:sz="4" w:space="0"/>
+                  <w:right w:val="single" w:color="auto" w:sz="4" w:space="0"/>
+                  <w:insideH w:val="single" w:color="auto" w:sz="4" w:space="0"/>
+                  <w:insideV w:val="single" w:color="auto" w:sz="4" w:space="0"/>
+                </w:tblBorders>
+                <w:tblCellMar>
+                  <w:top w:w="0" w:type="dxa"/>
+                  <w:left w:w="108" w:type="dxa"/>
+                  <w:bottom w:w="0" w:type="dxa"/>
+                  <w:right w:w="108" w:type="dxa"/>
+                </w:tblCellMar>
+              </w:tblPrEx>
+              <w:tc>
+                <w:tcPr>
+                  <w:tcW w:w="2539" w:type="dxa"/>
+                </w:tcPr>
+                <w:p>
+                  <w:pPr>
+                    <w:rPr>
+                      <w:rFonts w:cstheme="minorHAnsi"/>
+                    </w:rPr>
+                  </w:pPr>
+                  <w:r>
+                    <w:rPr>
+                      <w:rFonts w:cstheme="minorHAnsi"/>
+                    </w:rPr>
+                    <w:t>Ưu đãi</w:t>
+                  </w:r>
+                </w:p>
+              </w:tc>
+            </w:tr>
+          </w:tbl>
+          <w:tbl>
+            <w:tblPr>
+              <w:tblStyle w:val="5"/>
+              <w:tblpPr w:leftFromText="180" w:rightFromText="180" w:vertAnchor="text" w:horzAnchor="margin" w:tblpY="-274"/>
+              <w:tblOverlap w:val="never"/>
+              <w:tblW w:w="0" w:type="auto"/>
+              <w:tblInd w:w="0" w:type="dxa"/>
+              <w:tblBorders>
+                <w:top w:val="single" w:color="auto" w:sz="4" w:space="0"/>
+                <w:left w:val="single" w:color="auto" w:sz="4" w:space="0"/>
+                <w:bottom w:val="single" w:color="auto" w:sz="4" w:space="0"/>
+                <w:right w:val="single" w:color="auto" w:sz="4" w:space="0"/>
+                <w:insideH w:val="single" w:color="auto" w:sz="4" w:space="0"/>
+                <w:insideV w:val="single" w:color="auto" w:sz="4" w:space="0"/>
+              </w:tblBorders>
+              <w:tblLayout w:type="autofit"/>
+              <w:tblCellMar>
+                <w:top w:w="0" w:type="dxa"/>
+                <w:left w:w="108" w:type="dxa"/>
+                <w:bottom w:w="0" w:type="dxa"/>
+                <w:right w:w="108" w:type="dxa"/>
+              </w:tblCellMar>
+            </w:tblPr>
+            <w:tblGrid>
+              <w:gridCol w:w="1904"/>
+            </w:tblGrid>
+            <w:tr>
+              <w:tblPrEx>
+                <w:tblBorders>
+                  <w:top w:val="single" w:color="auto" w:sz="4" w:space="0"/>
+                  <w:left w:val="single" w:color="auto" w:sz="4" w:space="0"/>
+                  <w:bottom w:val="single" w:color="auto" w:sz="4" w:space="0"/>
+                  <w:right w:val="single" w:color="auto" w:sz="4" w:space="0"/>
+                  <w:insideH w:val="single" w:color="auto" w:sz="4" w:space="0"/>
+                  <w:insideV w:val="single" w:color="auto" w:sz="4" w:space="0"/>
+                </w:tblBorders>
+              </w:tblPrEx>
+              <w:tc>
+                <w:tcPr>
+                  <w:tcW w:w="2539" w:type="dxa"/>
+                </w:tcPr>
+                <w:p>
+                  <w:pPr>
+                    <w:rPr>
+                      <w:rFonts w:cstheme="minorHAnsi"/>
+                    </w:rPr>
+                  </w:pPr>
+                  <w:r>
+                    <w:rPr>
+                      <w:rFonts w:cstheme="minorHAnsi"/>
+                    </w:rPr>
+                    <w:t>Từ   999   VNĐ*</w:t>
+                  </w:r>
+                </w:p>
+              </w:tc>
+            </w:tr>
+          </w:tbl>
+          <w:p>
+            <w:pPr>
+              <w:rPr>
+                <w:rFonts w:cstheme="minorHAnsi"/>
+                <w:b/>
+                <w:bCs/>
+                <w:sz w:val="22"/>
+                <w:szCs w:val="22"/>
+              </w:rPr>
+            </w:pPr>
+          </w:p>
+          <w:p>
+            <w:pPr>
+              <w:ind w:right="-16"/>
+              <w:rPr>
+                <w:rFonts w:cstheme="minorHAnsi"/>
+                <w:b/>
+                <w:bCs/>
+              </w:rPr>
+            </w:pPr>
+            <w:r>
+              <w:rPr>
+                <w:rFonts w:cstheme="minorHAnsi"/>
+                <w:b/>
+                <w:bCs/>
+              </w:rPr>
+              <w:t>Giải pháp cải thiện tình trạng tóc thưa rụng chuyên nghiệp với quyền năng của Stemoxydine 5% và Resveratrol</w:t>
+            </w:r>
+          </w:p>
+          <w:p>
+            <w:pPr>
+              <w:ind w:right="-16"/>
+              <w:rPr>
+                <w:rFonts w:cstheme="minorHAnsi"/>
+                <w:b/>
+                <w:bCs/>
+              </w:rPr>
+            </w:pPr>
+            <w:r>
+              <w:rPr>
+                <w:rFonts w:cstheme="minorHAnsi"/>
+              </w:rPr>
+              <w:sym w:font="Wingdings 2" w:char="F020"/>
+            </w:r>
+            <w:r>
+              <w:rPr>
+                <w:rFonts w:cstheme="minorHAnsi"/>
+              </w:rPr>
+              <w:t>Cải thiện mật độ tóc chỉ trong</w:t>
+            </w:r>
+            <w:r>
+              <w:rPr>
+                <w:rFonts w:cstheme="minorHAnsi"/>
+                <w:b/>
+                <w:bCs/>
+              </w:rPr>
+              <w:t xml:space="preserve"> 6 tuần </w:t>
+            </w:r>
+          </w:p>
+          <w:p>
+            <w:pPr>
+              <w:jc w:val="center"/>
+              <w:rPr>
+                <w:rFonts w:cstheme="minorHAnsi"/>
+                <w:sz w:val="22"/>
+                <w:szCs w:val="22"/>
+              </w:rPr>
+            </w:pPr>
+          </w:p>
+        </w:tc>
+        <w:tc>
+          <w:tcPr>
+            <w:tcW w:w="2068" w:type="dxa"/>
           </w:tcPr>
           <w:p>
             <w:pPr>
@@ -21748,209 +21957,6 @@
                 <w:b/>
                 <w:bCs/>
               </w:rPr>
-              <w:t>Giải pháp cải thiện tình trạng tóc thưa rụng chuyên nghiệp với quyền năng của Stemoxydine 5% và Resveratrol</w:t>
-            </w:r>
-          </w:p>
-          <w:p>
-            <w:pPr>
-              <w:ind w:right="-16"/>
-              <w:rPr>
-                <w:rFonts w:cstheme="minorHAnsi"/>
-                <w:b/>
-                <w:bCs/>
-              </w:rPr>
-            </w:pPr>
-            <w:r>
-              <w:rPr>
-                <w:rFonts w:cstheme="minorHAnsi"/>
-              </w:rPr>
-              <w:sym w:font="Wingdings 2" w:char="F020"/>
-            </w:r>
-            <w:r>
-              <w:rPr>
-                <w:rFonts w:cstheme="minorHAnsi"/>
-              </w:rPr>
-              <w:t>Cải thiện mật độ tóc chỉ trong</w:t>
-            </w:r>
-            <w:r>
-              <w:rPr>
-                <w:rFonts w:cstheme="minorHAnsi"/>
-                <w:b/>
-                <w:bCs/>
-              </w:rPr>
-              <w:t xml:space="preserve"> 6 tuần </w:t>
-            </w:r>
-          </w:p>
-          <w:p>
-            <w:pPr>
-              <w:jc w:val="center"/>
-              <w:rPr>
-                <w:rFonts w:cstheme="minorHAnsi"/>
-                <w:sz w:val="22"/>
-                <w:szCs w:val="22"/>
-              </w:rPr>
-            </w:pPr>
-          </w:p>
-        </w:tc>
-        <w:tc>
-          <w:tcPr>
-            <w:tcW w:w="2068" w:type="dxa"/>
-          </w:tcPr>
-          <w:p>
-            <w:pPr>
-              <w:rPr>
-                <w:rFonts w:cstheme="minorHAnsi"/>
-                <w:b/>
-                <w:bCs/>
-                <w:sz w:val="22"/>
-                <w:szCs w:val="22"/>
-              </w:rPr>
-            </w:pPr>
-          </w:p>
-          <w:tbl>
-            <w:tblPr>
-              <w:tblStyle w:val="5"/>
-              <w:tblW w:w="0" w:type="auto"/>
-              <w:tblInd w:w="0" w:type="dxa"/>
-              <w:tblBorders>
-                <w:top w:val="single" w:color="auto" w:sz="4" w:space="0"/>
-                <w:left w:val="single" w:color="auto" w:sz="4" w:space="0"/>
-                <w:bottom w:val="single" w:color="auto" w:sz="4" w:space="0"/>
-                <w:right w:val="single" w:color="auto" w:sz="4" w:space="0"/>
-                <w:insideH w:val="single" w:color="auto" w:sz="4" w:space="0"/>
-                <w:insideV w:val="single" w:color="auto" w:sz="4" w:space="0"/>
-              </w:tblBorders>
-              <w:tblLayout w:type="autofit"/>
-              <w:tblCellMar>
-                <w:top w:w="0" w:type="dxa"/>
-                <w:left w:w="108" w:type="dxa"/>
-                <w:bottom w:w="0" w:type="dxa"/>
-                <w:right w:w="108" w:type="dxa"/>
-              </w:tblCellMar>
-            </w:tblPr>
-            <w:tblGrid>
-              <w:gridCol w:w="1904"/>
-            </w:tblGrid>
-            <w:tr>
-              <w:tblPrEx>
-                <w:tblBorders>
-                  <w:top w:val="single" w:color="auto" w:sz="4" w:space="0"/>
-                  <w:left w:val="single" w:color="auto" w:sz="4" w:space="0"/>
-                  <w:bottom w:val="single" w:color="auto" w:sz="4" w:space="0"/>
-                  <w:right w:val="single" w:color="auto" w:sz="4" w:space="0"/>
-                  <w:insideH w:val="single" w:color="auto" w:sz="4" w:space="0"/>
-                  <w:insideV w:val="single" w:color="auto" w:sz="4" w:space="0"/>
-                </w:tblBorders>
-                <w:tblCellMar>
-                  <w:top w:w="0" w:type="dxa"/>
-                  <w:left w:w="108" w:type="dxa"/>
-                  <w:bottom w:w="0" w:type="dxa"/>
-                  <w:right w:w="108" w:type="dxa"/>
-                </w:tblCellMar>
-              </w:tblPrEx>
-              <w:tc>
-                <w:tcPr>
-                  <w:tcW w:w="2539" w:type="dxa"/>
-                </w:tcPr>
-                <w:p>
-                  <w:pPr>
-                    <w:rPr>
-                      <w:rFonts w:cstheme="minorHAnsi"/>
-                    </w:rPr>
-                  </w:pPr>
-                  <w:r>
-                    <w:rPr>
-                      <w:rFonts w:cstheme="minorHAnsi"/>
-                    </w:rPr>
-                    <w:t>Ưu đãi</w:t>
-                  </w:r>
-                </w:p>
-              </w:tc>
-            </w:tr>
-          </w:tbl>
-          <w:tbl>
-            <w:tblPr>
-              <w:tblStyle w:val="5"/>
-              <w:tblpPr w:leftFromText="180" w:rightFromText="180" w:vertAnchor="text" w:horzAnchor="margin" w:tblpY="-274"/>
-              <w:tblOverlap w:val="never"/>
-              <w:tblW w:w="0" w:type="auto"/>
-              <w:tblInd w:w="0" w:type="dxa"/>
-              <w:tblBorders>
-                <w:top w:val="single" w:color="auto" w:sz="4" w:space="0"/>
-                <w:left w:val="single" w:color="auto" w:sz="4" w:space="0"/>
-                <w:bottom w:val="single" w:color="auto" w:sz="4" w:space="0"/>
-                <w:right w:val="single" w:color="auto" w:sz="4" w:space="0"/>
-                <w:insideH w:val="single" w:color="auto" w:sz="4" w:space="0"/>
-                <w:insideV w:val="single" w:color="auto" w:sz="4" w:space="0"/>
-              </w:tblBorders>
-              <w:tblLayout w:type="autofit"/>
-              <w:tblCellMar>
-                <w:top w:w="0" w:type="dxa"/>
-                <w:left w:w="108" w:type="dxa"/>
-                <w:bottom w:w="0" w:type="dxa"/>
-                <w:right w:w="108" w:type="dxa"/>
-              </w:tblCellMar>
-            </w:tblPr>
-            <w:tblGrid>
-              <w:gridCol w:w="1904"/>
-            </w:tblGrid>
-            <w:tr>
-              <w:tblPrEx>
-                <w:tblBorders>
-                  <w:top w:val="single" w:color="auto" w:sz="4" w:space="0"/>
-                  <w:left w:val="single" w:color="auto" w:sz="4" w:space="0"/>
-                  <w:bottom w:val="single" w:color="auto" w:sz="4" w:space="0"/>
-                  <w:right w:val="single" w:color="auto" w:sz="4" w:space="0"/>
-                  <w:insideH w:val="single" w:color="auto" w:sz="4" w:space="0"/>
-                  <w:insideV w:val="single" w:color="auto" w:sz="4" w:space="0"/>
-                </w:tblBorders>
-              </w:tblPrEx>
-              <w:tc>
-                <w:tcPr>
-                  <w:tcW w:w="2539" w:type="dxa"/>
-                </w:tcPr>
-                <w:p>
-                  <w:pPr>
-                    <w:rPr>
-                      <w:rFonts w:cstheme="minorHAnsi"/>
-                    </w:rPr>
-                  </w:pPr>
-                  <w:r>
-                    <w:rPr>
-                      <w:rFonts w:cstheme="minorHAnsi"/>
-                    </w:rPr>
-                    <w:t>Từ   999   VNĐ*</w:t>
-                  </w:r>
-                </w:p>
-              </w:tc>
-            </w:tr>
-          </w:tbl>
-          <w:p>
-            <w:pPr>
-              <w:rPr>
-                <w:rFonts w:cstheme="minorHAnsi"/>
-                <w:b/>
-                <w:bCs/>
-                <w:sz w:val="22"/>
-                <w:szCs w:val="22"/>
-              </w:rPr>
-            </w:pPr>
-          </w:p>
-          <w:p>
-            <w:pPr>
-              <w:ind w:right="-16"/>
-              <w:rPr>
-                <w:rFonts w:cstheme="minorHAnsi"/>
-                <w:b/>
-                <w:bCs/>
-              </w:rPr>
-            </w:pPr>
-            <w:r>
-              <w:rPr>
-                <w:rFonts w:cstheme="minorHAnsi"/>
-                <w:b/>
-                <w:bCs/>
-              </w:rPr>
               <w:t>Giải pháp kiểm soát bã nhờn chuyên nghiệp dành cho da đầu dư dầu với quyền năng của AHA 3% và Đất sét 6%</w:t>
             </w:r>
           </w:p>
@@ -22177,12 +22183,6 @@
                   <w:insideH w:val="single" w:color="auto" w:sz="4" w:space="0"/>
                   <w:insideV w:val="single" w:color="auto" w:sz="4" w:space="0"/>
                 </w:tblBorders>
-                <w:tblCellMar>
-                  <w:top w:w="0" w:type="dxa"/>
-                  <w:left w:w="108" w:type="dxa"/>
-                  <w:bottom w:w="0" w:type="dxa"/>
-                  <w:right w:w="108" w:type="dxa"/>
-                </w:tblCellMar>
               </w:tblPrEx>
               <w:tc>
                 <w:tcPr>
@@ -22381,6 +22381,12 @@
                   <w:insideH w:val="single" w:color="auto" w:sz="4" w:space="0"/>
                   <w:insideV w:val="single" w:color="auto" w:sz="4" w:space="0"/>
                 </w:tblBorders>
+                <w:tblCellMar>
+                  <w:top w:w="0" w:type="dxa"/>
+                  <w:left w:w="108" w:type="dxa"/>
+                  <w:bottom w:w="0" w:type="dxa"/>
+                  <w:right w:w="108" w:type="dxa"/>
+                </w:tblCellMar>
               </w:tblPrEx>
               <w:tc>
                 <w:tcPr>
@@ -22438,12 +22444,6 @@
                   <w:insideH w:val="single" w:color="auto" w:sz="4" w:space="0"/>
                   <w:insideV w:val="single" w:color="auto" w:sz="4" w:space="0"/>
                 </w:tblBorders>
-                <w:tblCellMar>
-                  <w:top w:w="0" w:type="dxa"/>
-                  <w:left w:w="108" w:type="dxa"/>
-                  <w:bottom w:w="0" w:type="dxa"/>
-                  <w:right w:w="108" w:type="dxa"/>
-                </w:tblCellMar>
               </w:tblPrEx>
               <w:tc>
                 <w:tcPr>
@@ -29486,12 +29486,6 @@
             <w:insideH w:val="single" w:color="auto" w:sz="4" w:space="0"/>
             <w:insideV w:val="single" w:color="auto" w:sz="4" w:space="0"/>
           </w:tblBorders>
-          <w:tblCellMar>
-            <w:top w:w="0" w:type="dxa"/>
-            <w:left w:w="108" w:type="dxa"/>
-            <w:bottom w:w="0" w:type="dxa"/>
-            <w:right w:w="108" w:type="dxa"/>
-          </w:tblCellMar>
         </w:tblPrEx>
         <w:tc>
           <w:tcPr>
@@ -35952,8 +35946,6 @@
                 <w:szCs w:val="24"/>
               </w:rPr>
             </w:pPr>
-            <w:bookmarkStart w:id="0" w:name="_GoBack"/>
-            <w:bookmarkEnd w:id="0"/>
           </w:p>
           <w:p>
             <w:pPr>

</xml_diff>